<commit_message>
Made more TMDB APIs
</commit_message>
<xml_diff>
--- a/WatchWise.docx
+++ b/WatchWise.docx
@@ -50,7 +50,7 @@
         <w:t>Trending Movies</w:t>
       </w:r>
       <w:r>
-        <w:t xml:space="preserve"> Check on normal python</w:t>
+        <w:t>: API Made</w:t>
       </w:r>
     </w:p>
     <w:p>
@@ -67,7 +67,10 @@
         <w:t>Trending Shows</w:t>
       </w:r>
       <w:r>
-        <w:t xml:space="preserve"> Checked on normal python</w:t>
+        <w:t xml:space="preserve"> </w:t>
+      </w:r>
+      <w:r>
+        <w:t>API Made</w:t>
       </w:r>
     </w:p>
     <w:p>
@@ -81,7 +84,13 @@
         <w:ind w:left="270" w:hanging="270"/>
       </w:pPr>
       <w:r>
-        <w:t>Top Rated Movies</w:t>
+        <w:t>Popular</w:t>
+      </w:r>
+      <w:r>
+        <w:t xml:space="preserve"> </w:t>
+      </w:r>
+      <w:r>
+        <w:t>Movies: API Made</w:t>
       </w:r>
     </w:p>
     <w:p>
@@ -95,7 +104,16 @@
         <w:ind w:left="270" w:hanging="270"/>
       </w:pPr>
       <w:r>
-        <w:t>Top Rated Shows</w:t>
+        <w:t>Popular</w:t>
+      </w:r>
+      <w:r>
+        <w:t xml:space="preserve"> Shows</w:t>
+      </w:r>
+      <w:r>
+        <w:t>:</w:t>
+      </w:r>
+      <w:r>
+        <w:t xml:space="preserve"> API Made</w:t>
       </w:r>
     </w:p>
     <w:p>
@@ -109,7 +127,10 @@
         <w:ind w:left="270" w:hanging="270"/>
       </w:pPr>
       <w:r>
-        <w:t>Browse genres then movies and shows from it</w:t>
+        <w:t>Top Rated Movies</w:t>
+      </w:r>
+      <w:r>
+        <w:t>: API Made</w:t>
       </w:r>
     </w:p>
     <w:p>
@@ -123,7 +144,10 @@
         <w:ind w:left="270" w:hanging="270"/>
       </w:pPr>
       <w:r>
-        <w:t>“XYZ” genre movies</w:t>
+        <w:t>Top Rated Shows</w:t>
+      </w:r>
+      <w:r>
+        <w:t>: API Made</w:t>
       </w:r>
     </w:p>
     <w:p>
@@ -137,7 +161,7 @@
         <w:ind w:left="270" w:hanging="270"/>
       </w:pPr>
       <w:r>
-        <w:t>“XYZ” genre shows</w:t>
+        <w:t>Get Movie by ID: API Made</w:t>
       </w:r>
     </w:p>
     <w:p>
@@ -151,7 +175,7 @@
         <w:ind w:left="270" w:hanging="270"/>
       </w:pPr>
       <w:r>
-        <w:t>Search button on every API</w:t>
+        <w:t>Get Show by ID: API Made</w:t>
       </w:r>
     </w:p>
     <w:p>
@@ -164,54 +188,9 @@
         <w:spacing w:after="0"/>
         <w:ind w:left="270" w:hanging="270"/>
       </w:pPr>
-      <w:r>
-        <w:t>Platform based movies and shows</w:t>
-      </w:r>
-    </w:p>
-    <w:p>
-      <w:pPr>
-        <w:spacing w:after="0"/>
-      </w:pPr>
-    </w:p>
-    <w:p>
-      <w:pPr>
-        <w:spacing w:after="0"/>
-      </w:pPr>
-      <w:r>
-        <w:t xml:space="preserve">I will first check these endpoints in normal python then make </w:t>
-      </w:r>
       <w:proofErr w:type="spellStart"/>
       <w:r>
-        <w:t>fastapi</w:t>
-      </w:r>
-      <w:proofErr w:type="spellEnd"/>
-      <w:r>
-        <w:t xml:space="preserve"> endpoints.</w:t>
-      </w:r>
-    </w:p>
-    <w:p>
-      <w:pPr>
-        <w:spacing w:after="0"/>
-      </w:pPr>
-    </w:p>
-    <w:p>
-      <w:pPr>
-        <w:spacing w:after="0"/>
-      </w:pPr>
-      <w:r>
-        <w:t xml:space="preserve">TMDB has movie/show id for movies/shows. With the id you can get title, </w:t>
-      </w:r>
-      <w:proofErr w:type="spellStart"/>
-      <w:r>
-        <w:t>poster_path</w:t>
-      </w:r>
-      <w:proofErr w:type="spellEnd"/>
-      <w:r>
-        <w:t xml:space="preserve">, overview, </w:t>
-      </w:r>
-      <w:proofErr w:type="spellStart"/>
-      <w:r>
-        <w:t>release_date</w:t>
+        <w:t>Similiar</w:t>
       </w:r>
       <w:proofErr w:type="spellEnd"/>
     </w:p>
@@ -226,7 +205,149 @@
         <w:ind w:left="270" w:hanging="270"/>
       </w:pPr>
       <w:r>
+        <w:t>Browse genres then movies and shows from it</w:t>
+      </w:r>
+    </w:p>
+    <w:p>
+      <w:pPr>
+        <w:pStyle w:val="ListParagraph"/>
+        <w:numPr>
+          <w:ilvl w:val="0"/>
+          <w:numId w:val="1"/>
+        </w:numPr>
+        <w:spacing w:after="0"/>
+        <w:ind w:left="270" w:hanging="270"/>
+      </w:pPr>
+      <w:r>
+        <w:t>“XYZ” genre movies</w:t>
+      </w:r>
+    </w:p>
+    <w:p>
+      <w:pPr>
+        <w:pStyle w:val="ListParagraph"/>
+        <w:numPr>
+          <w:ilvl w:val="0"/>
+          <w:numId w:val="1"/>
+        </w:numPr>
+        <w:spacing w:after="0"/>
+        <w:ind w:left="270" w:hanging="270"/>
+      </w:pPr>
+      <w:r>
+        <w:t>“XYZ” genre shows</w:t>
+      </w:r>
+    </w:p>
+    <w:p>
+      <w:pPr>
+        <w:pStyle w:val="ListParagraph"/>
+        <w:numPr>
+          <w:ilvl w:val="0"/>
+          <w:numId w:val="1"/>
+        </w:numPr>
+        <w:spacing w:after="0"/>
+        <w:ind w:left="270" w:hanging="270"/>
+      </w:pPr>
+      <w:r>
+        <w:t xml:space="preserve">Search button on </w:t>
+      </w:r>
+      <w:r>
+        <w:t>Shows and Movies by ID: API Made</w:t>
+      </w:r>
+    </w:p>
+    <w:p>
+      <w:pPr>
+        <w:pStyle w:val="ListParagraph"/>
+        <w:numPr>
+          <w:ilvl w:val="0"/>
+          <w:numId w:val="1"/>
+        </w:numPr>
+        <w:spacing w:after="0"/>
+        <w:ind w:left="270" w:hanging="270"/>
+      </w:pPr>
+      <w:r>
+        <w:t>Platform based movies and shows</w:t>
+      </w:r>
+      <w:r>
+        <w:t xml:space="preserve"> like Netflix, Disney+, Prime</w:t>
+      </w:r>
+    </w:p>
+    <w:p>
+      <w:pPr>
+        <w:spacing w:after="0"/>
+      </w:pPr>
+    </w:p>
+    <w:p>
+      <w:pPr>
+        <w:spacing w:after="0"/>
+      </w:pPr>
+      <w:r>
+        <w:t xml:space="preserve">I will first check these endpoints in normal python then make </w:t>
+      </w:r>
+      <w:proofErr w:type="spellStart"/>
+      <w:r>
+        <w:t>fastapi</w:t>
+      </w:r>
+      <w:proofErr w:type="spellEnd"/>
+      <w:r>
+        <w:t xml:space="preserve"> endpoints.</w:t>
+      </w:r>
+    </w:p>
+    <w:p>
+      <w:pPr>
+        <w:spacing w:after="0"/>
+      </w:pPr>
+    </w:p>
+    <w:p>
+      <w:pPr>
+        <w:spacing w:after="0"/>
+      </w:pPr>
+      <w:r>
+        <w:t xml:space="preserve">TMDB has movie/show id for movies/shows. With the id you can get title, </w:t>
+      </w:r>
+      <w:proofErr w:type="spellStart"/>
+      <w:r>
+        <w:t>poster_path</w:t>
+      </w:r>
+      <w:proofErr w:type="spellEnd"/>
+      <w:r>
+        <w:t xml:space="preserve">, overview, </w:t>
+      </w:r>
+      <w:proofErr w:type="spellStart"/>
+      <w:r>
+        <w:t>release_date</w:t>
+      </w:r>
+      <w:proofErr w:type="spellEnd"/>
+    </w:p>
+    <w:p>
+      <w:pPr>
+        <w:spacing w:after="0"/>
+      </w:pPr>
+    </w:p>
+    <w:p>
+      <w:pPr>
+        <w:pStyle w:val="ListParagraph"/>
+        <w:numPr>
+          <w:ilvl w:val="0"/>
+          <w:numId w:val="1"/>
+        </w:numPr>
+        <w:spacing w:after="0"/>
+        <w:ind w:left="270" w:hanging="270"/>
+      </w:pPr>
+      <w:r>
         <w:t>Because You Watched “XYZ” Movies/Shows</w:t>
+      </w:r>
+    </w:p>
+    <w:p>
+      <w:pPr>
+        <w:pStyle w:val="ListParagraph"/>
+        <w:numPr>
+          <w:ilvl w:val="0"/>
+          <w:numId w:val="1"/>
+        </w:numPr>
+        <w:spacing w:after="0"/>
+        <w:ind w:left="270" w:hanging="270"/>
+      </w:pPr>
+      <w:r>
+        <w:t>Recommendation API by genres</w:t>
       </w:r>
     </w:p>
     <w:p>

</xml_diff>

<commit_message>
Added models.py & database.py
</commit_message>
<xml_diff>
--- a/WatchWise.docx
+++ b/WatchWise.docx
@@ -188,11 +188,12 @@
         <w:spacing w:after="0"/>
         <w:ind w:left="270" w:hanging="270"/>
       </w:pPr>
-      <w:proofErr w:type="spellStart"/>
-      <w:r>
-        <w:t>Similiar</w:t>
-      </w:r>
-      <w:proofErr w:type="spellEnd"/>
+      <w:r>
+        <w:t xml:space="preserve">Browse </w:t>
+      </w:r>
+      <w:r>
+        <w:t>movie genre: API Made</w:t>
+      </w:r>
     </w:p>
     <w:p>
       <w:pPr>
@@ -205,7 +206,7 @@
         <w:ind w:left="270" w:hanging="270"/>
       </w:pPr>
       <w:r>
-        <w:t>Browse genres then movies and shows from it</w:t>
+        <w:t>Browse show genre: API Made</w:t>
       </w:r>
     </w:p>
     <w:p>
@@ -221,6 +222,9 @@
       <w:r>
         <w:t>“XYZ” genre movies</w:t>
       </w:r>
+      <w:r>
+        <w:t>: API Made</w:t>
+      </w:r>
     </w:p>
     <w:p>
       <w:pPr>
@@ -235,6 +239,9 @@
       <w:r>
         <w:t>“XYZ” genre shows</w:t>
       </w:r>
+      <w:r>
+        <w:t>: API Made</w:t>
+      </w:r>
     </w:p>
     <w:p>
       <w:pPr>
@@ -247,11 +254,63 @@
         <w:ind w:left="270" w:hanging="270"/>
       </w:pPr>
       <w:r>
-        <w:t xml:space="preserve">Search button on </w:t>
-      </w:r>
-      <w:r>
-        <w:t>Shows and Movies by ID: API Made</w:t>
-      </w:r>
+        <w:t>Platform based movies and shows</w:t>
+      </w:r>
+      <w:r>
+        <w:t xml:space="preserve"> like Netflix, Disney+, Prime</w:t>
+      </w:r>
+    </w:p>
+    <w:p>
+      <w:pPr>
+        <w:spacing w:after="0"/>
+      </w:pPr>
+    </w:p>
+    <w:p>
+      <w:pPr>
+        <w:spacing w:after="0"/>
+      </w:pPr>
+      <w:r>
+        <w:t xml:space="preserve">I will first check these endpoints in normal python then make </w:t>
+      </w:r>
+      <w:proofErr w:type="spellStart"/>
+      <w:r>
+        <w:t>fastapi</w:t>
+      </w:r>
+      <w:proofErr w:type="spellEnd"/>
+      <w:r>
+        <w:t xml:space="preserve"> endpoints.</w:t>
+      </w:r>
+    </w:p>
+    <w:p>
+      <w:pPr>
+        <w:spacing w:after="0"/>
+      </w:pPr>
+    </w:p>
+    <w:p>
+      <w:pPr>
+        <w:spacing w:after="0"/>
+      </w:pPr>
+      <w:r>
+        <w:t xml:space="preserve">TMDB has movie/show id for movies/shows. With the id you can get title, </w:t>
+      </w:r>
+      <w:proofErr w:type="spellStart"/>
+      <w:r>
+        <w:t>poster_path</w:t>
+      </w:r>
+      <w:proofErr w:type="spellEnd"/>
+      <w:r>
+        <w:t xml:space="preserve">, overview, </w:t>
+      </w:r>
+      <w:proofErr w:type="spellStart"/>
+      <w:r>
+        <w:t>release_date</w:t>
+      </w:r>
+      <w:proofErr w:type="spellEnd"/>
+    </w:p>
+    <w:p>
+      <w:pPr>
+        <w:spacing w:after="0"/>
+      </w:pPr>
     </w:p>
     <w:p>
       <w:pPr>
@@ -264,96 +323,8 @@
         <w:ind w:left="270" w:hanging="270"/>
       </w:pPr>
       <w:r>
-        <w:t>Platform based movies and shows</w:t>
-      </w:r>
-      <w:r>
-        <w:t xml:space="preserve"> like Netflix, Disney+, Prime</w:t>
-      </w:r>
-    </w:p>
-    <w:p>
-      <w:pPr>
-        <w:spacing w:after="0"/>
-      </w:pPr>
-    </w:p>
-    <w:p>
-      <w:pPr>
-        <w:spacing w:after="0"/>
-      </w:pPr>
-      <w:r>
-        <w:t xml:space="preserve">I will first check these endpoints in normal python then make </w:t>
-      </w:r>
-      <w:proofErr w:type="spellStart"/>
-      <w:r>
-        <w:t>fastapi</w:t>
-      </w:r>
-      <w:proofErr w:type="spellEnd"/>
-      <w:r>
-        <w:t xml:space="preserve"> endpoints.</w:t>
-      </w:r>
-    </w:p>
-    <w:p>
-      <w:pPr>
-        <w:spacing w:after="0"/>
-      </w:pPr>
-    </w:p>
-    <w:p>
-      <w:pPr>
-        <w:spacing w:after="0"/>
-      </w:pPr>
-      <w:r>
-        <w:t xml:space="preserve">TMDB has movie/show id for movies/shows. With the id you can get title, </w:t>
-      </w:r>
-      <w:proofErr w:type="spellStart"/>
-      <w:r>
-        <w:t>poster_path</w:t>
-      </w:r>
-      <w:proofErr w:type="spellEnd"/>
-      <w:r>
-        <w:t xml:space="preserve">, overview, </w:t>
-      </w:r>
-      <w:proofErr w:type="spellStart"/>
-      <w:r>
-        <w:t>release_date</w:t>
-      </w:r>
-      <w:proofErr w:type="spellEnd"/>
-    </w:p>
-    <w:p>
-      <w:pPr>
-        <w:spacing w:after="0"/>
-      </w:pPr>
-    </w:p>
-    <w:p>
-      <w:pPr>
-        <w:pStyle w:val="ListParagraph"/>
-        <w:numPr>
-          <w:ilvl w:val="0"/>
-          <w:numId w:val="1"/>
-        </w:numPr>
-        <w:spacing w:after="0"/>
-        <w:ind w:left="270" w:hanging="270"/>
-      </w:pPr>
-      <w:r>
         <w:t>Because You Watched “XYZ” Movies/Shows</w:t>
       </w:r>
-    </w:p>
-    <w:p>
-      <w:pPr>
-        <w:pStyle w:val="ListParagraph"/>
-        <w:numPr>
-          <w:ilvl w:val="0"/>
-          <w:numId w:val="1"/>
-        </w:numPr>
-        <w:spacing w:after="0"/>
-        <w:ind w:left="270" w:hanging="270"/>
-      </w:pPr>
-      <w:r>
-        <w:t>Recommendation API by genres</w:t>
-      </w:r>
-    </w:p>
-    <w:p>
-      <w:pPr>
-        <w:spacing w:after="0"/>
-      </w:pPr>
     </w:p>
     <w:p>
       <w:pPr>

</xml_diff>